<commit_message>
Rebuild: Lecture 2 changes, title slide in every session deck, AI-use guide
</commit_message>
<xml_diff>
--- a/en/files/resources/Writing_and_Submission_Checklist.docx
+++ b/en/files/resources/Writing_and_Submission_Checklist.docx
@@ -1677,6 +1677,58 @@
           </w:tcPr>
           <w:p>
             <w:pPr>
+              <w:keepNext/>
+              <w:spacing w:after="0" w:line="252" w:lineRule="auto"/>
+            </w:pPr>
+            <w:r>
+              <w:rPr>
+                <w:rFonts w:ascii="Segoe UI Symbol" w:hAnsi="Segoe UI Symbol" w:cs="Segoe UI Symbol" w:eastAsia="Segoe UI Symbol"/>
+                <w:sz w:val="18"/>
+              </w:rPr>
+              <w:t>☐</w:t>
+            </w:r>
+          </w:p>
+        </w:tc>
+        <w:tc>
+          <w:tcPr>
+            <w:tcW w:type="dxa" w:w="8957"/>
+            <w:tcBorders>
+              <w:top w:val="single" w:sz="4" w:color="D5DDE1"/>
+              <w:left w:val="single" w:sz="4" w:color="D5DDE1"/>
+              <w:bottom w:val="single" w:sz="4" w:color="D5DDE1"/>
+              <w:right w:val="single" w:sz="4" w:color="D5DDE1"/>
+            </w:tcBorders>
+          </w:tcPr>
+          <w:p>
+            <w:pPr>
+              <w:keepNext/>
+              <w:spacing w:after="0" w:line="252" w:lineRule="auto"/>
+            </w:pPr>
+            <w:r>
+              <w:rPr>
+                <w:sz w:val="18"/>
+              </w:rPr>
+              <w:t>AI used only as the journal allows, and declared: see AI_Use_Guidance.pdf for the journal rules and an example statement</w:t>
+            </w:r>
+          </w:p>
+        </w:tc>
+      </w:tr>
+      <w:tr>
+        <w:trPr>
+          <w:cantSplit w:val="true"/>
+        </w:trPr>
+        <w:tc>
+          <w:tcPr>
+            <w:tcW w:type="dxa" w:w="454"/>
+            <w:tcBorders>
+              <w:top w:val="single" w:sz="4" w:color="D5DDE1"/>
+              <w:left w:val="single" w:sz="4" w:color="D5DDE1"/>
+              <w:bottom w:val="single" w:sz="4" w:color="D5DDE1"/>
+              <w:right w:val="single" w:sz="4" w:color="D5DDE1"/>
+            </w:tcBorders>
+          </w:tcPr>
+          <w:p>
+            <w:pPr>
               <w:spacing w:after="0" w:line="252" w:lineRule="auto"/>
             </w:pPr>
             <w:r>

</xml_diff>